<commit_message>
Added content summary for the documentation
</commit_message>
<xml_diff>
--- a/documentation/Dokumentáció.docx
+++ b/documentation/Dokumentáció.docx
@@ -5,7 +5,13 @@
     <w:sdt>
       <w:sdtPr>
         <w:rPr>
+          <w:rFonts w:asciiTheme="majorHAnsi" w:eastAsiaTheme="majorEastAsia" w:hAnsiTheme="majorHAnsi" w:cstheme="majorBidi"/>
+          <w:color w:val="0F4761" w:themeColor="accent1" w:themeShade="BF"/>
+          <w:kern w:val="2"/>
           <w:sz w:val="2"/>
+          <w:szCs w:val="32"/>
+          <w:lang w:eastAsia="en-US"/>
+          <w14:ligatures w14:val="standardContextual"/>
         </w:rPr>
         <w:id w:val="-1297376507"/>
         <w:docPartObj>
@@ -15,19 +21,13 @@
       </w:sdtPr>
       <w:sdtEndPr>
         <w:rPr>
-          <w:rFonts w:asciiTheme="majorHAnsi" w:eastAsiaTheme="majorEastAsia" w:hAnsiTheme="majorHAnsi" w:cstheme="majorBidi"/>
-          <w:color w:val="0F4761" w:themeColor="accent1" w:themeShade="BF"/>
-          <w:kern w:val="2"/>
           <w:sz w:val="32"/>
-          <w:szCs w:val="32"/>
-          <w:lang w:eastAsia="en-US"/>
-          <w14:ligatures w14:val="standardContextual"/>
         </w:rPr>
       </w:sdtEndPr>
       <w:sdtContent>
         <w:p>
           <w:pPr>
-            <w:pStyle w:val="Nincstrkz"/>
+            <w:pStyle w:val="NoSpacing"/>
             <w:rPr>
               <w:sz w:val="2"/>
             </w:rPr>
@@ -111,7 +111,7 @@
                                 <w:sdtContent>
                                   <w:p>
                                     <w:pPr>
-                                      <w:pStyle w:val="Nincstrkz"/>
+                                      <w:pStyle w:val="NoSpacing"/>
                                       <w:rPr>
                                         <w:rFonts w:asciiTheme="majorHAnsi" w:eastAsiaTheme="majorEastAsia" w:hAnsiTheme="majorHAnsi" w:cstheme="majorBidi"/>
                                         <w:caps/>
@@ -152,7 +152,7 @@
                               </w:sdt>
                               <w:p>
                                 <w:pPr>
-                                  <w:pStyle w:val="Nincstrkz"/>
+                                  <w:pStyle w:val="NoSpacing"/>
                                   <w:spacing w:before="120"/>
                                   <w:rPr>
                                     <w:color w:val="156082" w:themeColor="accent1"/>
@@ -235,7 +235,7 @@
                           <w:sdtContent>
                             <w:p>
                               <w:pPr>
-                                <w:pStyle w:val="Nincstrkz"/>
+                                <w:pStyle w:val="NoSpacing"/>
                                 <w:rPr>
                                   <w:rFonts w:asciiTheme="majorHAnsi" w:eastAsiaTheme="majorEastAsia" w:hAnsiTheme="majorHAnsi" w:cstheme="majorBidi"/>
                                   <w:caps/>
@@ -276,7 +276,7 @@
                         </w:sdt>
                         <w:p>
                           <w:pPr>
-                            <w:pStyle w:val="Nincstrkz"/>
+                            <w:pStyle w:val="NoSpacing"/>
                             <w:spacing w:before="120"/>
                             <w:rPr>
                               <w:color w:val="156082" w:themeColor="accent1"/>
@@ -909,7 +909,7 @@
                             <w:txbxContent>
                               <w:p>
                                 <w:pPr>
-                                  <w:pStyle w:val="Nincstrkz"/>
+                                  <w:pStyle w:val="NoSpacing"/>
                                   <w:jc w:val="right"/>
                                   <w:rPr>
                                     <w:color w:val="156082" w:themeColor="accent1"/>
@@ -958,7 +958,7 @@
                                 <w:sdtContent>
                                   <w:p>
                                     <w:pPr>
-                                      <w:pStyle w:val="Nincstrkz"/>
+                                      <w:pStyle w:val="NoSpacing"/>
                                       <w:jc w:val="right"/>
                                       <w:rPr>
                                         <w:color w:val="156082" w:themeColor="accent1"/>
@@ -1013,7 +1013,7 @@
                       <w:txbxContent>
                         <w:p>
                           <w:pPr>
-                            <w:pStyle w:val="Nincstrkz"/>
+                            <w:pStyle w:val="NoSpacing"/>
                             <w:jc w:val="right"/>
                             <w:rPr>
                               <w:color w:val="156082" w:themeColor="accent1"/>
@@ -1062,7 +1062,7 @@
                           <w:sdtContent>
                             <w:p>
                               <w:pPr>
-                                <w:pStyle w:val="Nincstrkz"/>
+                                <w:pStyle w:val="NoSpacing"/>
                                 <w:jc w:val="right"/>
                                 <w:rPr>
                                   <w:color w:val="156082" w:themeColor="accent1"/>
@@ -1101,7 +1101,7 @@
         </w:p>
         <w:p>
           <w:pPr>
-            <w:pStyle w:val="Cmsor1"/>
+            <w:pStyle w:val="Heading1"/>
             <w:numPr>
               <w:ilvl w:val="0"/>
               <w:numId w:val="1"/>
@@ -1110,22 +1110,26 @@
           <w:r>
             <w:br w:type="page"/>
           </w:r>
+          <w:bookmarkStart w:id="0" w:name="_Toc213932579"/>
           <w:r>
             <w:lastRenderedPageBreak/>
             <w:t>Bevezetés</w:t>
           </w:r>
+          <w:bookmarkEnd w:id="0"/>
         </w:p>
         <w:p>
           <w:pPr>
-            <w:pStyle w:val="Cmsor2"/>
+            <w:pStyle w:val="Heading2"/>
             <w:numPr>
               <w:ilvl w:val="1"/>
               <w:numId w:val="1"/>
             </w:numPr>
           </w:pPr>
+          <w:bookmarkStart w:id="1" w:name="_Toc213932580"/>
           <w:r>
             <w:t>A projekt célja</w:t>
           </w:r>
+          <w:bookmarkEnd w:id="1"/>
         </w:p>
         <w:p>
           <w:r>
@@ -1150,12 +1154,13 @@
         <w:p/>
         <w:p>
           <w:pPr>
-            <w:pStyle w:val="Cmsor2"/>
+            <w:pStyle w:val="Heading2"/>
             <w:numPr>
               <w:ilvl w:val="1"/>
               <w:numId w:val="1"/>
             </w:numPr>
           </w:pPr>
+          <w:bookmarkStart w:id="2" w:name="_Toc213932581"/>
           <w:r>
             <w:t>A projek</w:t>
           </w:r>
@@ -1165,39 +1170,26 @@
         </w:p>
       </w:sdtContent>
     </w:sdt>
+    <w:bookmarkEnd w:id="2" w:displacedByCustomXml="prev"/>
     <w:p>
       <w:r>
-        <w:t xml:space="preserve">A tervezet szerint az alkalmazás rendelkezni fog egy webes, asztali és mobil </w:t>
-      </w:r>
-      <w:proofErr w:type="gramStart"/>
-      <w:r>
-        <w:t>felülettel</w:t>
-      </w:r>
-      <w:proofErr w:type="gramEnd"/>
-      <w:r>
-        <w:t xml:space="preserve"> amely alkalmazások felhasználói felületei ugyanazt a dizájn sémát fogják követni. A három platformot egy központi szerver fogja </w:t>
-      </w:r>
-      <w:proofErr w:type="gramStart"/>
-      <w:r>
-        <w:t>össze</w:t>
-      </w:r>
-      <w:proofErr w:type="gramEnd"/>
-      <w:r>
-        <w:t xml:space="preserve"> amely intézi mind a webes felület kiszolgálását a háttérszámításokat és egy adatbázis kiszolgálását is.</w:t>
+        <w:t>A tervezet szerint az alkalmazás rendelkezni fog egy webes, asztali és mobil felülettel amely alkalmazások felhasználói felületei ugyanazt a dizájn sémát fogják követni. A három platformot egy központi szerver fogja össze amely intézi mind a webes felület kiszolgálását a háttérszámításokat és egy adatbázis kiszolgálását is.</w:t>
       </w:r>
     </w:p>
     <w:p/>
     <w:p>
       <w:pPr>
-        <w:pStyle w:val="Cmsor3"/>
+        <w:pStyle w:val="Heading3"/>
         <w:numPr>
           <w:ilvl w:val="2"/>
           <w:numId w:val="1"/>
         </w:numPr>
       </w:pPr>
+      <w:bookmarkStart w:id="3" w:name="_Toc213932582"/>
       <w:r>
         <w:t>Webalkalmazás</w:t>
       </w:r>
+      <w:bookmarkEnd w:id="3"/>
     </w:p>
     <w:p>
       <w:r>
@@ -1207,27 +1199,23 @@
         <w:t>JavaScript</w:t>
       </w:r>
       <w:r>
-        <w:t xml:space="preserve"> keretrendszer felhasználásával, a szerveroldali funkcionalitást PHP-val </w:t>
-      </w:r>
-      <w:r>
-        <w:t>fogjuk kivitelezni</w:t>
-      </w:r>
-      <w:r>
-        <w:t>.</w:t>
+        <w:t xml:space="preserve"> keretrendszer felhasználásával, a szerveroldali funkcionalitást PHP-val fogjuk kivitelezni.</w:t>
       </w:r>
     </w:p>
     <w:p/>
     <w:p>
       <w:pPr>
-        <w:pStyle w:val="Cmsor3"/>
+        <w:pStyle w:val="Heading3"/>
         <w:numPr>
           <w:ilvl w:val="2"/>
           <w:numId w:val="1"/>
         </w:numPr>
       </w:pPr>
+      <w:bookmarkStart w:id="4" w:name="_Toc213932583"/>
       <w:r>
         <w:t>Asztali alkalmazás</w:t>
       </w:r>
+      <w:bookmarkEnd w:id="4"/>
     </w:p>
     <w:p>
       <w:r>
@@ -1240,15 +1228,17 @@
     <w:p/>
     <w:p>
       <w:pPr>
-        <w:pStyle w:val="Cmsor3"/>
+        <w:pStyle w:val="Heading3"/>
         <w:numPr>
           <w:ilvl w:val="2"/>
           <w:numId w:val="1"/>
         </w:numPr>
       </w:pPr>
+      <w:bookmarkStart w:id="5" w:name="_Toc213932584"/>
       <w:r>
         <w:t>Mobil alkalmazás terve</w:t>
       </w:r>
+      <w:bookmarkEnd w:id="5"/>
     </w:p>
     <w:p>
       <w:pPr>
@@ -1260,66 +1250,799 @@
     </w:p>
     <w:p>
       <w:pPr>
-        <w:pStyle w:val="Cmsor3"/>
+        <w:pStyle w:val="Heading3"/>
         <w:numPr>
           <w:ilvl w:val="2"/>
           <w:numId w:val="1"/>
         </w:numPr>
       </w:pPr>
+      <w:bookmarkStart w:id="6" w:name="_Toc213932585"/>
       <w:r>
         <w:t>Adatbázis</w:t>
       </w:r>
+      <w:bookmarkEnd w:id="6"/>
     </w:p>
     <w:p>
       <w:r>
         <w:t>A felhasználói és egyéb adatokat egy MySQL szerver felhasználásával fogjuk tárolni</w:t>
       </w:r>
     </w:p>
+    <w:p/>
     <w:p>
       <w:pPr>
-        <w:pStyle w:val="Cmsor3"/>
+        <w:pStyle w:val="Heading3"/>
         <w:numPr>
           <w:ilvl w:val="2"/>
           <w:numId w:val="1"/>
         </w:numPr>
       </w:pPr>
+      <w:bookmarkStart w:id="7" w:name="_Toc213932586"/>
       <w:r>
+        <w:lastRenderedPageBreak/>
         <w:t>Fejlesztés</w:t>
+      </w:r>
+      <w:bookmarkEnd w:id="7"/>
+    </w:p>
+    <w:p>
+      <w:r>
+        <w:t>A fejlesztés során felhasználásra fog kerülni a Trello a feladatok beosztása és a közös munka gördülékenyebbé tétele érdekében. A kódbázis egy privát GitHub repository-ban lesz megosztva a projekt fejlesztői között amely helytől és időtől függetleníti ezáltal rugalmasabbá teszi az alkalmazás fejlesztését. A fejlesztés során a Docker konténerizációs megoldását fogjuk használni a maximális stabilitás és a kész projekt egyszer</w:t>
+      </w:r>
+      <w:r>
+        <w:t xml:space="preserve"> </w:t>
+      </w:r>
+      <w:r>
+        <w:t>ű telepítése érdekében.</w:t>
       </w:r>
     </w:p>
     <w:p>
-      <w:pPr>
-        <w:rPr>
-          <w:rFonts w:eastAsiaTheme="majorEastAsia" w:cstheme="majorBidi"/>
-          <w:color w:val="0F4761" w:themeColor="accent1" w:themeShade="BF"/>
-          <w:sz w:val="28"/>
-          <w:szCs w:val="28"/>
-        </w:rPr>
-      </w:pPr>
       <w:r>
         <w:br w:type="page"/>
       </w:r>
     </w:p>
-    <w:p>
-      <w:pPr>
-        <w:pStyle w:val="Cmsor3"/>
-        <w:numPr>
-          <w:ilvl w:val="2"/>
-          <w:numId w:val="1"/>
-        </w:numPr>
-      </w:pPr>
-    </w:p>
+    <w:p/>
+    <w:sdt>
+      <w:sdtPr>
+        <w:id w:val="-1297907132"/>
+        <w:docPartObj>
+          <w:docPartGallery w:val="Table of Contents"/>
+          <w:docPartUnique/>
+        </w:docPartObj>
+      </w:sdtPr>
+      <w:sdtEndPr>
+        <w:rPr>
+          <w:rFonts w:asciiTheme="minorHAnsi" w:eastAsiaTheme="minorHAnsi" w:hAnsiTheme="minorHAnsi" w:cstheme="minorBidi"/>
+          <w:b/>
+          <w:bCs/>
+          <w:noProof/>
+          <w:color w:val="auto"/>
+          <w:kern w:val="2"/>
+          <w:sz w:val="24"/>
+          <w:szCs w:val="24"/>
+          <w:lang w:val="hu-HU"/>
+          <w14:ligatures w14:val="standardContextual"/>
+        </w:rPr>
+      </w:sdtEndPr>
+      <w:sdtContent>
+        <w:p>
+          <w:pPr>
+            <w:pStyle w:val="TOCHeading"/>
+          </w:pPr>
+          <w:r>
+            <w:t>Contents</w:t>
+          </w:r>
+        </w:p>
+        <w:p>
+          <w:pPr>
+            <w:pStyle w:val="TOC1"/>
+            <w:tabs>
+              <w:tab w:val="left" w:pos="480"/>
+              <w:tab w:val="right" w:leader="dot" w:pos="9062"/>
+            </w:tabs>
+            <w:rPr>
+              <w:rFonts w:eastAsiaTheme="minorEastAsia"/>
+              <w:noProof/>
+              <w:lang w:eastAsia="hu-HU"/>
+            </w:rPr>
+          </w:pPr>
+          <w:r>
+            <w:fldChar w:fldCharType="begin"/>
+          </w:r>
+          <w:r>
+            <w:instrText xml:space="preserve"> TOC \o "1-3" \h \z \u </w:instrText>
+          </w:r>
+          <w:r>
+            <w:fldChar w:fldCharType="separate"/>
+          </w:r>
+          <w:hyperlink w:anchor="_Toc213932579" w:history="1">
+            <w:r>
+              <w:rPr>
+                <w:rStyle w:val="Hyperlink"/>
+                <w:noProof/>
+              </w:rPr>
+              <w:t>1.</w:t>
+            </w:r>
+            <w:r>
+              <w:rPr>
+                <w:rFonts w:eastAsiaTheme="minorEastAsia"/>
+                <w:noProof/>
+                <w:lang w:eastAsia="hu-HU"/>
+              </w:rPr>
+              <w:tab/>
+            </w:r>
+            <w:r>
+              <w:rPr>
+                <w:rStyle w:val="Hyperlink"/>
+                <w:noProof/>
+              </w:rPr>
+              <w:t>Bevezetés</w:t>
+            </w:r>
+            <w:r>
+              <w:rPr>
+                <w:noProof/>
+                <w:webHidden/>
+              </w:rPr>
+              <w:tab/>
+            </w:r>
+            <w:r>
+              <w:rPr>
+                <w:noProof/>
+                <w:webHidden/>
+              </w:rPr>
+              <w:fldChar w:fldCharType="begin"/>
+            </w:r>
+            <w:r>
+              <w:rPr>
+                <w:noProof/>
+                <w:webHidden/>
+              </w:rPr>
+              <w:instrText xml:space="preserve"> PAGEREF _Toc213932579 \h </w:instrText>
+            </w:r>
+            <w:r>
+              <w:rPr>
+                <w:noProof/>
+                <w:webHidden/>
+              </w:rPr>
+            </w:r>
+            <w:r>
+              <w:rPr>
+                <w:noProof/>
+                <w:webHidden/>
+              </w:rPr>
+              <w:fldChar w:fldCharType="separate"/>
+            </w:r>
+            <w:r>
+              <w:rPr>
+                <w:noProof/>
+                <w:webHidden/>
+              </w:rPr>
+              <w:t>1</w:t>
+            </w:r>
+            <w:r>
+              <w:rPr>
+                <w:noProof/>
+                <w:webHidden/>
+              </w:rPr>
+              <w:fldChar w:fldCharType="end"/>
+            </w:r>
+          </w:hyperlink>
+        </w:p>
+        <w:p>
+          <w:pPr>
+            <w:pStyle w:val="TOC2"/>
+            <w:tabs>
+              <w:tab w:val="left" w:pos="960"/>
+              <w:tab w:val="right" w:leader="dot" w:pos="9062"/>
+            </w:tabs>
+            <w:rPr>
+              <w:rFonts w:eastAsiaTheme="minorEastAsia"/>
+              <w:noProof/>
+              <w:lang w:eastAsia="hu-HU"/>
+            </w:rPr>
+          </w:pPr>
+          <w:hyperlink w:anchor="_Toc213932580" w:history="1">
+            <w:r>
+              <w:rPr>
+                <w:rStyle w:val="Hyperlink"/>
+                <w:noProof/>
+              </w:rPr>
+              <w:t>1.1</w:t>
+            </w:r>
+            <w:r>
+              <w:rPr>
+                <w:rFonts w:eastAsiaTheme="minorEastAsia"/>
+                <w:noProof/>
+                <w:lang w:eastAsia="hu-HU"/>
+              </w:rPr>
+              <w:tab/>
+            </w:r>
+            <w:r>
+              <w:rPr>
+                <w:rStyle w:val="Hyperlink"/>
+                <w:noProof/>
+              </w:rPr>
+              <w:t>A projekt célja</w:t>
+            </w:r>
+            <w:r>
+              <w:rPr>
+                <w:noProof/>
+                <w:webHidden/>
+              </w:rPr>
+              <w:tab/>
+            </w:r>
+            <w:r>
+              <w:rPr>
+                <w:noProof/>
+                <w:webHidden/>
+              </w:rPr>
+              <w:fldChar w:fldCharType="begin"/>
+            </w:r>
+            <w:r>
+              <w:rPr>
+                <w:noProof/>
+                <w:webHidden/>
+              </w:rPr>
+              <w:instrText xml:space="preserve"> PAGEREF _Toc213932580 \h </w:instrText>
+            </w:r>
+            <w:r>
+              <w:rPr>
+                <w:noProof/>
+                <w:webHidden/>
+              </w:rPr>
+            </w:r>
+            <w:r>
+              <w:rPr>
+                <w:noProof/>
+                <w:webHidden/>
+              </w:rPr>
+              <w:fldChar w:fldCharType="separate"/>
+            </w:r>
+            <w:r>
+              <w:rPr>
+                <w:noProof/>
+                <w:webHidden/>
+              </w:rPr>
+              <w:t>1</w:t>
+            </w:r>
+            <w:r>
+              <w:rPr>
+                <w:noProof/>
+                <w:webHidden/>
+              </w:rPr>
+              <w:fldChar w:fldCharType="end"/>
+            </w:r>
+          </w:hyperlink>
+        </w:p>
+        <w:p>
+          <w:pPr>
+            <w:pStyle w:val="TOC2"/>
+            <w:tabs>
+              <w:tab w:val="left" w:pos="960"/>
+              <w:tab w:val="right" w:leader="dot" w:pos="9062"/>
+            </w:tabs>
+            <w:rPr>
+              <w:rFonts w:eastAsiaTheme="minorEastAsia"/>
+              <w:noProof/>
+              <w:lang w:eastAsia="hu-HU"/>
+            </w:rPr>
+          </w:pPr>
+          <w:hyperlink w:anchor="_Toc213932581" w:history="1">
+            <w:r>
+              <w:rPr>
+                <w:rStyle w:val="Hyperlink"/>
+                <w:noProof/>
+              </w:rPr>
+              <w:t>1.2</w:t>
+            </w:r>
+            <w:r>
+              <w:rPr>
+                <w:rFonts w:eastAsiaTheme="minorEastAsia"/>
+                <w:noProof/>
+                <w:lang w:eastAsia="hu-HU"/>
+              </w:rPr>
+              <w:tab/>
+            </w:r>
+            <w:r>
+              <w:rPr>
+                <w:rStyle w:val="Hyperlink"/>
+                <w:noProof/>
+              </w:rPr>
+              <w:t>A projekt tervezete</w:t>
+            </w:r>
+            <w:r>
+              <w:rPr>
+                <w:noProof/>
+                <w:webHidden/>
+              </w:rPr>
+              <w:tab/>
+            </w:r>
+            <w:r>
+              <w:rPr>
+                <w:noProof/>
+                <w:webHidden/>
+              </w:rPr>
+              <w:fldChar w:fldCharType="begin"/>
+            </w:r>
+            <w:r>
+              <w:rPr>
+                <w:noProof/>
+                <w:webHidden/>
+              </w:rPr>
+              <w:instrText xml:space="preserve"> PAGEREF _Toc213932581 \h </w:instrText>
+            </w:r>
+            <w:r>
+              <w:rPr>
+                <w:noProof/>
+                <w:webHidden/>
+              </w:rPr>
+            </w:r>
+            <w:r>
+              <w:rPr>
+                <w:noProof/>
+                <w:webHidden/>
+              </w:rPr>
+              <w:fldChar w:fldCharType="separate"/>
+            </w:r>
+            <w:r>
+              <w:rPr>
+                <w:noProof/>
+                <w:webHidden/>
+              </w:rPr>
+              <w:t>1</w:t>
+            </w:r>
+            <w:r>
+              <w:rPr>
+                <w:noProof/>
+                <w:webHidden/>
+              </w:rPr>
+              <w:fldChar w:fldCharType="end"/>
+            </w:r>
+          </w:hyperlink>
+        </w:p>
+        <w:p>
+          <w:pPr>
+            <w:pStyle w:val="TOC3"/>
+            <w:tabs>
+              <w:tab w:val="left" w:pos="1440"/>
+              <w:tab w:val="right" w:leader="dot" w:pos="9062"/>
+            </w:tabs>
+            <w:rPr>
+              <w:rFonts w:eastAsiaTheme="minorEastAsia"/>
+              <w:noProof/>
+              <w:lang w:eastAsia="hu-HU"/>
+            </w:rPr>
+          </w:pPr>
+          <w:hyperlink w:anchor="_Toc213932582" w:history="1">
+            <w:r>
+              <w:rPr>
+                <w:rStyle w:val="Hyperlink"/>
+                <w:noProof/>
+              </w:rPr>
+              <w:t>1.2.1</w:t>
+            </w:r>
+            <w:r>
+              <w:rPr>
+                <w:rFonts w:eastAsiaTheme="minorEastAsia"/>
+                <w:noProof/>
+                <w:lang w:eastAsia="hu-HU"/>
+              </w:rPr>
+              <w:tab/>
+            </w:r>
+            <w:r>
+              <w:rPr>
+                <w:rStyle w:val="Hyperlink"/>
+                <w:noProof/>
+              </w:rPr>
+              <w:t>Webalkalmazás</w:t>
+            </w:r>
+            <w:r>
+              <w:rPr>
+                <w:noProof/>
+                <w:webHidden/>
+              </w:rPr>
+              <w:tab/>
+            </w:r>
+            <w:r>
+              <w:rPr>
+                <w:noProof/>
+                <w:webHidden/>
+              </w:rPr>
+              <w:fldChar w:fldCharType="begin"/>
+            </w:r>
+            <w:r>
+              <w:rPr>
+                <w:noProof/>
+                <w:webHidden/>
+              </w:rPr>
+              <w:instrText xml:space="preserve"> PAGEREF _Toc213932582 \h </w:instrText>
+            </w:r>
+            <w:r>
+              <w:rPr>
+                <w:noProof/>
+                <w:webHidden/>
+              </w:rPr>
+            </w:r>
+            <w:r>
+              <w:rPr>
+                <w:noProof/>
+                <w:webHidden/>
+              </w:rPr>
+              <w:fldChar w:fldCharType="separate"/>
+            </w:r>
+            <w:r>
+              <w:rPr>
+                <w:noProof/>
+                <w:webHidden/>
+              </w:rPr>
+              <w:t>1</w:t>
+            </w:r>
+            <w:r>
+              <w:rPr>
+                <w:noProof/>
+                <w:webHidden/>
+              </w:rPr>
+              <w:fldChar w:fldCharType="end"/>
+            </w:r>
+          </w:hyperlink>
+        </w:p>
+        <w:p>
+          <w:pPr>
+            <w:pStyle w:val="TOC3"/>
+            <w:tabs>
+              <w:tab w:val="left" w:pos="1440"/>
+              <w:tab w:val="right" w:leader="dot" w:pos="9062"/>
+            </w:tabs>
+            <w:rPr>
+              <w:rFonts w:eastAsiaTheme="minorEastAsia"/>
+              <w:noProof/>
+              <w:lang w:eastAsia="hu-HU"/>
+            </w:rPr>
+          </w:pPr>
+          <w:hyperlink w:anchor="_Toc213932583" w:history="1">
+            <w:r>
+              <w:rPr>
+                <w:rStyle w:val="Hyperlink"/>
+                <w:noProof/>
+              </w:rPr>
+              <w:t>1.2.2</w:t>
+            </w:r>
+            <w:r>
+              <w:rPr>
+                <w:rFonts w:eastAsiaTheme="minorEastAsia"/>
+                <w:noProof/>
+                <w:lang w:eastAsia="hu-HU"/>
+              </w:rPr>
+              <w:tab/>
+            </w:r>
+            <w:r>
+              <w:rPr>
+                <w:rStyle w:val="Hyperlink"/>
+                <w:noProof/>
+              </w:rPr>
+              <w:t>Asztali alkalmazás</w:t>
+            </w:r>
+            <w:r>
+              <w:rPr>
+                <w:noProof/>
+                <w:webHidden/>
+              </w:rPr>
+              <w:tab/>
+            </w:r>
+            <w:r>
+              <w:rPr>
+                <w:noProof/>
+                <w:webHidden/>
+              </w:rPr>
+              <w:fldChar w:fldCharType="begin"/>
+            </w:r>
+            <w:r>
+              <w:rPr>
+                <w:noProof/>
+                <w:webHidden/>
+              </w:rPr>
+              <w:instrText xml:space="preserve"> PAGEREF _Toc213932583 \h </w:instrText>
+            </w:r>
+            <w:r>
+              <w:rPr>
+                <w:noProof/>
+                <w:webHidden/>
+              </w:rPr>
+            </w:r>
+            <w:r>
+              <w:rPr>
+                <w:noProof/>
+                <w:webHidden/>
+              </w:rPr>
+              <w:fldChar w:fldCharType="separate"/>
+            </w:r>
+            <w:r>
+              <w:rPr>
+                <w:noProof/>
+                <w:webHidden/>
+              </w:rPr>
+              <w:t>1</w:t>
+            </w:r>
+            <w:r>
+              <w:rPr>
+                <w:noProof/>
+                <w:webHidden/>
+              </w:rPr>
+              <w:fldChar w:fldCharType="end"/>
+            </w:r>
+          </w:hyperlink>
+        </w:p>
+        <w:p>
+          <w:pPr>
+            <w:pStyle w:val="TOC3"/>
+            <w:tabs>
+              <w:tab w:val="left" w:pos="1440"/>
+              <w:tab w:val="right" w:leader="dot" w:pos="9062"/>
+            </w:tabs>
+            <w:rPr>
+              <w:rFonts w:eastAsiaTheme="minorEastAsia"/>
+              <w:noProof/>
+              <w:lang w:eastAsia="hu-HU"/>
+            </w:rPr>
+          </w:pPr>
+          <w:hyperlink w:anchor="_Toc213932584" w:history="1">
+            <w:r>
+              <w:rPr>
+                <w:rStyle w:val="Hyperlink"/>
+                <w:noProof/>
+              </w:rPr>
+              <w:t>1.2.3</w:t>
+            </w:r>
+            <w:r>
+              <w:rPr>
+                <w:rFonts w:eastAsiaTheme="minorEastAsia"/>
+                <w:noProof/>
+                <w:lang w:eastAsia="hu-HU"/>
+              </w:rPr>
+              <w:tab/>
+            </w:r>
+            <w:r>
+              <w:rPr>
+                <w:rStyle w:val="Hyperlink"/>
+                <w:noProof/>
+              </w:rPr>
+              <w:t>Mobil alkalmazás terve</w:t>
+            </w:r>
+            <w:r>
+              <w:rPr>
+                <w:noProof/>
+                <w:webHidden/>
+              </w:rPr>
+              <w:tab/>
+            </w:r>
+            <w:r>
+              <w:rPr>
+                <w:noProof/>
+                <w:webHidden/>
+              </w:rPr>
+              <w:fldChar w:fldCharType="begin"/>
+            </w:r>
+            <w:r>
+              <w:rPr>
+                <w:noProof/>
+                <w:webHidden/>
+              </w:rPr>
+              <w:instrText xml:space="preserve"> PAGEREF _Toc213932584 \h </w:instrText>
+            </w:r>
+            <w:r>
+              <w:rPr>
+                <w:noProof/>
+                <w:webHidden/>
+              </w:rPr>
+            </w:r>
+            <w:r>
+              <w:rPr>
+                <w:noProof/>
+                <w:webHidden/>
+              </w:rPr>
+              <w:fldChar w:fldCharType="separate"/>
+            </w:r>
+            <w:r>
+              <w:rPr>
+                <w:noProof/>
+                <w:webHidden/>
+              </w:rPr>
+              <w:t>1</w:t>
+            </w:r>
+            <w:r>
+              <w:rPr>
+                <w:noProof/>
+                <w:webHidden/>
+              </w:rPr>
+              <w:fldChar w:fldCharType="end"/>
+            </w:r>
+          </w:hyperlink>
+        </w:p>
+        <w:p>
+          <w:pPr>
+            <w:pStyle w:val="TOC3"/>
+            <w:tabs>
+              <w:tab w:val="left" w:pos="1440"/>
+              <w:tab w:val="right" w:leader="dot" w:pos="9062"/>
+            </w:tabs>
+            <w:rPr>
+              <w:rFonts w:eastAsiaTheme="minorEastAsia"/>
+              <w:noProof/>
+              <w:lang w:eastAsia="hu-HU"/>
+            </w:rPr>
+          </w:pPr>
+          <w:hyperlink w:anchor="_Toc213932585" w:history="1">
+            <w:r>
+              <w:rPr>
+                <w:rStyle w:val="Hyperlink"/>
+                <w:noProof/>
+              </w:rPr>
+              <w:t>1.2.4</w:t>
+            </w:r>
+            <w:r>
+              <w:rPr>
+                <w:rFonts w:eastAsiaTheme="minorEastAsia"/>
+                <w:noProof/>
+                <w:lang w:eastAsia="hu-HU"/>
+              </w:rPr>
+              <w:tab/>
+            </w:r>
+            <w:r>
+              <w:rPr>
+                <w:rStyle w:val="Hyperlink"/>
+                <w:noProof/>
+              </w:rPr>
+              <w:t>Adatbázis</w:t>
+            </w:r>
+            <w:r>
+              <w:rPr>
+                <w:noProof/>
+                <w:webHidden/>
+              </w:rPr>
+              <w:tab/>
+            </w:r>
+            <w:r>
+              <w:rPr>
+                <w:noProof/>
+                <w:webHidden/>
+              </w:rPr>
+              <w:fldChar w:fldCharType="begin"/>
+            </w:r>
+            <w:r>
+              <w:rPr>
+                <w:noProof/>
+                <w:webHidden/>
+              </w:rPr>
+              <w:instrText xml:space="preserve"> PAGEREF _Toc213932585 \h </w:instrText>
+            </w:r>
+            <w:r>
+              <w:rPr>
+                <w:noProof/>
+                <w:webHidden/>
+              </w:rPr>
+            </w:r>
+            <w:r>
+              <w:rPr>
+                <w:noProof/>
+                <w:webHidden/>
+              </w:rPr>
+              <w:fldChar w:fldCharType="separate"/>
+            </w:r>
+            <w:r>
+              <w:rPr>
+                <w:noProof/>
+                <w:webHidden/>
+              </w:rPr>
+              <w:t>1</w:t>
+            </w:r>
+            <w:r>
+              <w:rPr>
+                <w:noProof/>
+                <w:webHidden/>
+              </w:rPr>
+              <w:fldChar w:fldCharType="end"/>
+            </w:r>
+          </w:hyperlink>
+        </w:p>
+        <w:p>
+          <w:pPr>
+            <w:pStyle w:val="TOC3"/>
+            <w:tabs>
+              <w:tab w:val="left" w:pos="1440"/>
+              <w:tab w:val="right" w:leader="dot" w:pos="9062"/>
+            </w:tabs>
+            <w:rPr>
+              <w:rFonts w:eastAsiaTheme="minorEastAsia"/>
+              <w:noProof/>
+              <w:lang w:eastAsia="hu-HU"/>
+            </w:rPr>
+          </w:pPr>
+          <w:hyperlink w:anchor="_Toc213932586" w:history="1">
+            <w:r>
+              <w:rPr>
+                <w:rStyle w:val="Hyperlink"/>
+                <w:noProof/>
+              </w:rPr>
+              <w:t>1.2.5</w:t>
+            </w:r>
+            <w:r>
+              <w:rPr>
+                <w:rFonts w:eastAsiaTheme="minorEastAsia"/>
+                <w:noProof/>
+                <w:lang w:eastAsia="hu-HU"/>
+              </w:rPr>
+              <w:tab/>
+            </w:r>
+            <w:r>
+              <w:rPr>
+                <w:rStyle w:val="Hyperlink"/>
+                <w:noProof/>
+              </w:rPr>
+              <w:t>Fejlesztés</w:t>
+            </w:r>
+            <w:r>
+              <w:rPr>
+                <w:noProof/>
+                <w:webHidden/>
+              </w:rPr>
+              <w:tab/>
+            </w:r>
+            <w:r>
+              <w:rPr>
+                <w:noProof/>
+                <w:webHidden/>
+              </w:rPr>
+              <w:fldChar w:fldCharType="begin"/>
+            </w:r>
+            <w:r>
+              <w:rPr>
+                <w:noProof/>
+                <w:webHidden/>
+              </w:rPr>
+              <w:instrText xml:space="preserve"> PAGEREF _Toc213932586 \h </w:instrText>
+            </w:r>
+            <w:r>
+              <w:rPr>
+                <w:noProof/>
+                <w:webHidden/>
+              </w:rPr>
+            </w:r>
+            <w:r>
+              <w:rPr>
+                <w:noProof/>
+                <w:webHidden/>
+              </w:rPr>
+              <w:fldChar w:fldCharType="separate"/>
+            </w:r>
+            <w:r>
+              <w:rPr>
+                <w:noProof/>
+                <w:webHidden/>
+              </w:rPr>
+              <w:t>2</w:t>
+            </w:r>
+            <w:r>
+              <w:rPr>
+                <w:noProof/>
+                <w:webHidden/>
+              </w:rPr>
+              <w:fldChar w:fldCharType="end"/>
+            </w:r>
+          </w:hyperlink>
+        </w:p>
+        <w:p>
+          <w:r>
+            <w:rPr>
+              <w:b/>
+              <w:bCs/>
+              <w:noProof/>
+            </w:rPr>
+            <w:fldChar w:fldCharType="end"/>
+          </w:r>
+        </w:p>
+      </w:sdtContent>
+    </w:sdt>
     <w:p>
       <w:r>
-        <w:t xml:space="preserve">A fejlesztés során felhasználásra fog kerülni a Trello a feladatok beosztása és a közös munka gördülékenyebbé tétele érdekében. A kódbázis egy privát GitHub repository-ban lesz megosztva a projekt fejlesztői </w:t>
-      </w:r>
-      <w:proofErr w:type="gramStart"/>
-      <w:r>
-        <w:t>között</w:t>
-      </w:r>
-      <w:proofErr w:type="gramEnd"/>
-      <w:r>
-        <w:t xml:space="preserve"> amely helytől és időtől függetleníti ezáltal rugalmasabbá teszi az alkalmazás fejlesztését. A fejlesztés során a Docker konténerizációs megoldását fogjuk használni a maximális stabilitás és a kész projekt egyszerű telepítése érdekében.</w:t>
+        <w:br w:type="page"/>
       </w:r>
     </w:p>
     <w:sectPr>
@@ -1860,15 +2583,15 @@
     <w:lsdException w:name="Unresolved Mention" w:semiHidden="1" w:unhideWhenUsed="1"/>
     <w:lsdException w:name="Smart Link" w:semiHidden="1" w:unhideWhenUsed="1"/>
   </w:latentStyles>
-  <w:style w:type="paragraph" w:default="1" w:styleId="Norml">
+  <w:style w:type="paragraph" w:default="1" w:styleId="Normal">
     <w:name w:val="Normal"/>
     <w:qFormat/>
   </w:style>
-  <w:style w:type="paragraph" w:styleId="Cmsor1">
+  <w:style w:type="paragraph" w:styleId="Heading1">
     <w:name w:val="heading 1"/>
-    <w:basedOn w:val="Norml"/>
-    <w:next w:val="Norml"/>
-    <w:link w:val="Cmsor1Char"/>
+    <w:basedOn w:val="Normal"/>
+    <w:next w:val="Normal"/>
+    <w:link w:val="Heading1Char"/>
     <w:uiPriority w:val="9"/>
     <w:qFormat/>
     <w:rsid w:val="00C3069D"/>
@@ -1885,11 +2608,11 @@
       <w:szCs w:val="40"/>
     </w:rPr>
   </w:style>
-  <w:style w:type="paragraph" w:styleId="Cmsor2">
+  <w:style w:type="paragraph" w:styleId="Heading2">
     <w:name w:val="heading 2"/>
-    <w:basedOn w:val="Norml"/>
-    <w:next w:val="Norml"/>
-    <w:link w:val="Cmsor2Char"/>
+    <w:basedOn w:val="Normal"/>
+    <w:next w:val="Normal"/>
+    <w:link w:val="Heading2Char"/>
     <w:uiPriority w:val="9"/>
     <w:unhideWhenUsed/>
     <w:qFormat/>
@@ -1907,11 +2630,11 @@
       <w:szCs w:val="32"/>
     </w:rPr>
   </w:style>
-  <w:style w:type="paragraph" w:styleId="Cmsor3">
+  <w:style w:type="paragraph" w:styleId="Heading3">
     <w:name w:val="heading 3"/>
-    <w:basedOn w:val="Norml"/>
-    <w:next w:val="Norml"/>
-    <w:link w:val="Cmsor3Char"/>
+    <w:basedOn w:val="Normal"/>
+    <w:next w:val="Normal"/>
+    <w:link w:val="Heading3Char"/>
     <w:uiPriority w:val="9"/>
     <w:unhideWhenUsed/>
     <w:qFormat/>
@@ -1929,11 +2652,11 @@
       <w:szCs w:val="28"/>
     </w:rPr>
   </w:style>
-  <w:style w:type="paragraph" w:styleId="Cmsor4">
+  <w:style w:type="paragraph" w:styleId="Heading4">
     <w:name w:val="heading 4"/>
-    <w:basedOn w:val="Norml"/>
-    <w:next w:val="Norml"/>
-    <w:link w:val="Cmsor4Char"/>
+    <w:basedOn w:val="Normal"/>
+    <w:next w:val="Normal"/>
+    <w:link w:val="Heading4Char"/>
     <w:uiPriority w:val="9"/>
     <w:semiHidden/>
     <w:unhideWhenUsed/>
@@ -1952,11 +2675,11 @@
       <w:color w:val="0F4761" w:themeColor="accent1" w:themeShade="BF"/>
     </w:rPr>
   </w:style>
-  <w:style w:type="paragraph" w:styleId="Cmsor5">
+  <w:style w:type="paragraph" w:styleId="Heading5">
     <w:name w:val="heading 5"/>
-    <w:basedOn w:val="Norml"/>
-    <w:next w:val="Norml"/>
-    <w:link w:val="Cmsor5Char"/>
+    <w:basedOn w:val="Normal"/>
+    <w:next w:val="Normal"/>
+    <w:link w:val="Heading5Char"/>
     <w:uiPriority w:val="9"/>
     <w:semiHidden/>
     <w:unhideWhenUsed/>
@@ -1973,11 +2696,11 @@
       <w:color w:val="0F4761" w:themeColor="accent1" w:themeShade="BF"/>
     </w:rPr>
   </w:style>
-  <w:style w:type="paragraph" w:styleId="Cmsor6">
+  <w:style w:type="paragraph" w:styleId="Heading6">
     <w:name w:val="heading 6"/>
-    <w:basedOn w:val="Norml"/>
-    <w:next w:val="Norml"/>
-    <w:link w:val="Cmsor6Char"/>
+    <w:basedOn w:val="Normal"/>
+    <w:next w:val="Normal"/>
+    <w:link w:val="Heading6Char"/>
     <w:uiPriority w:val="9"/>
     <w:semiHidden/>
     <w:unhideWhenUsed/>
@@ -1996,11 +2719,11 @@
       <w:color w:val="595959" w:themeColor="text1" w:themeTint="A6"/>
     </w:rPr>
   </w:style>
-  <w:style w:type="paragraph" w:styleId="Cmsor7">
+  <w:style w:type="paragraph" w:styleId="Heading7">
     <w:name w:val="heading 7"/>
-    <w:basedOn w:val="Norml"/>
-    <w:next w:val="Norml"/>
-    <w:link w:val="Cmsor7Char"/>
+    <w:basedOn w:val="Normal"/>
+    <w:next w:val="Normal"/>
+    <w:link w:val="Heading7Char"/>
     <w:uiPriority w:val="9"/>
     <w:semiHidden/>
     <w:unhideWhenUsed/>
@@ -2017,11 +2740,11 @@
       <w:color w:val="595959" w:themeColor="text1" w:themeTint="A6"/>
     </w:rPr>
   </w:style>
-  <w:style w:type="paragraph" w:styleId="Cmsor8">
+  <w:style w:type="paragraph" w:styleId="Heading8">
     <w:name w:val="heading 8"/>
-    <w:basedOn w:val="Norml"/>
-    <w:next w:val="Norml"/>
-    <w:link w:val="Cmsor8Char"/>
+    <w:basedOn w:val="Normal"/>
+    <w:next w:val="Normal"/>
+    <w:link w:val="Heading8Char"/>
     <w:uiPriority w:val="9"/>
     <w:semiHidden/>
     <w:unhideWhenUsed/>
@@ -2040,11 +2763,11 @@
       <w:color w:val="272727" w:themeColor="text1" w:themeTint="D8"/>
     </w:rPr>
   </w:style>
-  <w:style w:type="paragraph" w:styleId="Cmsor9">
+  <w:style w:type="paragraph" w:styleId="Heading9">
     <w:name w:val="heading 9"/>
-    <w:basedOn w:val="Norml"/>
-    <w:next w:val="Norml"/>
-    <w:link w:val="Cmsor9Char"/>
+    <w:basedOn w:val="Normal"/>
+    <w:next w:val="Normal"/>
+    <w:link w:val="Heading9Char"/>
     <w:uiPriority w:val="9"/>
     <w:semiHidden/>
     <w:unhideWhenUsed/>
@@ -2061,13 +2784,13 @@
       <w:color w:val="272727" w:themeColor="text1" w:themeTint="D8"/>
     </w:rPr>
   </w:style>
-  <w:style w:type="character" w:default="1" w:styleId="Bekezdsalapbettpusa">
+  <w:style w:type="character" w:default="1" w:styleId="DefaultParagraphFont">
     <w:name w:val="Default Paragraph Font"/>
     <w:uiPriority w:val="1"/>
     <w:semiHidden/>
     <w:unhideWhenUsed/>
   </w:style>
-  <w:style w:type="table" w:default="1" w:styleId="Normltblzat">
+  <w:style w:type="table" w:default="1" w:styleId="TableNormal">
     <w:name w:val="Normal Table"/>
     <w:uiPriority w:val="99"/>
     <w:semiHidden/>
@@ -2082,16 +2805,16 @@
       </w:tblCellMar>
     </w:tblPr>
   </w:style>
-  <w:style w:type="numbering" w:default="1" w:styleId="Nemlista">
+  <w:style w:type="numbering" w:default="1" w:styleId="NoList">
     <w:name w:val="No List"/>
     <w:uiPriority w:val="99"/>
     <w:semiHidden/>
     <w:unhideWhenUsed/>
   </w:style>
-  <w:style w:type="character" w:customStyle="1" w:styleId="Cmsor1Char">
-    <w:name w:val="Címsor 1 Char"/>
-    <w:basedOn w:val="Bekezdsalapbettpusa"/>
-    <w:link w:val="Cmsor1"/>
+  <w:style w:type="character" w:customStyle="1" w:styleId="Heading1Char">
+    <w:name w:val="Heading 1 Char"/>
+    <w:basedOn w:val="DefaultParagraphFont"/>
+    <w:link w:val="Heading1"/>
     <w:uiPriority w:val="9"/>
     <w:rsid w:val="00C3069D"/>
     <w:rPr>
@@ -2101,10 +2824,10 @@
       <w:szCs w:val="40"/>
     </w:rPr>
   </w:style>
-  <w:style w:type="character" w:customStyle="1" w:styleId="Cmsor2Char">
-    <w:name w:val="Címsor 2 Char"/>
-    <w:basedOn w:val="Bekezdsalapbettpusa"/>
-    <w:link w:val="Cmsor2"/>
+  <w:style w:type="character" w:customStyle="1" w:styleId="Heading2Char">
+    <w:name w:val="Heading 2 Char"/>
+    <w:basedOn w:val="DefaultParagraphFont"/>
+    <w:link w:val="Heading2"/>
     <w:uiPriority w:val="9"/>
     <w:rsid w:val="00C3069D"/>
     <w:rPr>
@@ -2114,10 +2837,10 @@
       <w:szCs w:val="32"/>
     </w:rPr>
   </w:style>
-  <w:style w:type="character" w:customStyle="1" w:styleId="Cmsor3Char">
-    <w:name w:val="Címsor 3 Char"/>
-    <w:basedOn w:val="Bekezdsalapbettpusa"/>
-    <w:link w:val="Cmsor3"/>
+  <w:style w:type="character" w:customStyle="1" w:styleId="Heading3Char">
+    <w:name w:val="Heading 3 Char"/>
+    <w:basedOn w:val="DefaultParagraphFont"/>
+    <w:link w:val="Heading3"/>
     <w:uiPriority w:val="9"/>
     <w:rsid w:val="00C3069D"/>
     <w:rPr>
@@ -2127,10 +2850,10 @@
       <w:szCs w:val="28"/>
     </w:rPr>
   </w:style>
-  <w:style w:type="character" w:customStyle="1" w:styleId="Cmsor4Char">
-    <w:name w:val="Címsor 4 Char"/>
-    <w:basedOn w:val="Bekezdsalapbettpusa"/>
-    <w:link w:val="Cmsor4"/>
+  <w:style w:type="character" w:customStyle="1" w:styleId="Heading4Char">
+    <w:name w:val="Heading 4 Char"/>
+    <w:basedOn w:val="DefaultParagraphFont"/>
+    <w:link w:val="Heading4"/>
     <w:uiPriority w:val="9"/>
     <w:semiHidden/>
     <w:rsid w:val="00C3069D"/>
@@ -2141,10 +2864,10 @@
       <w:color w:val="0F4761" w:themeColor="accent1" w:themeShade="BF"/>
     </w:rPr>
   </w:style>
-  <w:style w:type="character" w:customStyle="1" w:styleId="Cmsor5Char">
-    <w:name w:val="Címsor 5 Char"/>
-    <w:basedOn w:val="Bekezdsalapbettpusa"/>
-    <w:link w:val="Cmsor5"/>
+  <w:style w:type="character" w:customStyle="1" w:styleId="Heading5Char">
+    <w:name w:val="Heading 5 Char"/>
+    <w:basedOn w:val="DefaultParagraphFont"/>
+    <w:link w:val="Heading5"/>
     <w:uiPriority w:val="9"/>
     <w:semiHidden/>
     <w:rsid w:val="00C3069D"/>
@@ -2153,10 +2876,10 @@
       <w:color w:val="0F4761" w:themeColor="accent1" w:themeShade="BF"/>
     </w:rPr>
   </w:style>
-  <w:style w:type="character" w:customStyle="1" w:styleId="Cmsor6Char">
-    <w:name w:val="Címsor 6 Char"/>
-    <w:basedOn w:val="Bekezdsalapbettpusa"/>
-    <w:link w:val="Cmsor6"/>
+  <w:style w:type="character" w:customStyle="1" w:styleId="Heading6Char">
+    <w:name w:val="Heading 6 Char"/>
+    <w:basedOn w:val="DefaultParagraphFont"/>
+    <w:link w:val="Heading6"/>
     <w:uiPriority w:val="9"/>
     <w:semiHidden/>
     <w:rsid w:val="00C3069D"/>
@@ -2167,10 +2890,10 @@
       <w:color w:val="595959" w:themeColor="text1" w:themeTint="A6"/>
     </w:rPr>
   </w:style>
-  <w:style w:type="character" w:customStyle="1" w:styleId="Cmsor7Char">
-    <w:name w:val="Címsor 7 Char"/>
-    <w:basedOn w:val="Bekezdsalapbettpusa"/>
-    <w:link w:val="Cmsor7"/>
+  <w:style w:type="character" w:customStyle="1" w:styleId="Heading7Char">
+    <w:name w:val="Heading 7 Char"/>
+    <w:basedOn w:val="DefaultParagraphFont"/>
+    <w:link w:val="Heading7"/>
     <w:uiPriority w:val="9"/>
     <w:semiHidden/>
     <w:rsid w:val="00C3069D"/>
@@ -2179,10 +2902,10 @@
       <w:color w:val="595959" w:themeColor="text1" w:themeTint="A6"/>
     </w:rPr>
   </w:style>
-  <w:style w:type="character" w:customStyle="1" w:styleId="Cmsor8Char">
-    <w:name w:val="Címsor 8 Char"/>
-    <w:basedOn w:val="Bekezdsalapbettpusa"/>
-    <w:link w:val="Cmsor8"/>
+  <w:style w:type="character" w:customStyle="1" w:styleId="Heading8Char">
+    <w:name w:val="Heading 8 Char"/>
+    <w:basedOn w:val="DefaultParagraphFont"/>
+    <w:link w:val="Heading8"/>
     <w:uiPriority w:val="9"/>
     <w:semiHidden/>
     <w:rsid w:val="00C3069D"/>
@@ -2193,10 +2916,10 @@
       <w:color w:val="272727" w:themeColor="text1" w:themeTint="D8"/>
     </w:rPr>
   </w:style>
-  <w:style w:type="character" w:customStyle="1" w:styleId="Cmsor9Char">
-    <w:name w:val="Címsor 9 Char"/>
-    <w:basedOn w:val="Bekezdsalapbettpusa"/>
-    <w:link w:val="Cmsor9"/>
+  <w:style w:type="character" w:customStyle="1" w:styleId="Heading9Char">
+    <w:name w:val="Heading 9 Char"/>
+    <w:basedOn w:val="DefaultParagraphFont"/>
+    <w:link w:val="Heading9"/>
     <w:uiPriority w:val="9"/>
     <w:semiHidden/>
     <w:rsid w:val="00C3069D"/>
@@ -2205,11 +2928,11 @@
       <w:color w:val="272727" w:themeColor="text1" w:themeTint="D8"/>
     </w:rPr>
   </w:style>
-  <w:style w:type="paragraph" w:styleId="Cm">
+  <w:style w:type="paragraph" w:styleId="Title">
     <w:name w:val="Title"/>
-    <w:basedOn w:val="Norml"/>
-    <w:next w:val="Norml"/>
-    <w:link w:val="CmChar"/>
+    <w:basedOn w:val="Normal"/>
+    <w:next w:val="Normal"/>
+    <w:link w:val="TitleChar"/>
     <w:uiPriority w:val="10"/>
     <w:qFormat/>
     <w:rsid w:val="00C3069D"/>
@@ -2225,10 +2948,10 @@
       <w:szCs w:val="56"/>
     </w:rPr>
   </w:style>
-  <w:style w:type="character" w:customStyle="1" w:styleId="CmChar">
-    <w:name w:val="Cím Char"/>
-    <w:basedOn w:val="Bekezdsalapbettpusa"/>
-    <w:link w:val="Cm"/>
+  <w:style w:type="character" w:customStyle="1" w:styleId="TitleChar">
+    <w:name w:val="Title Char"/>
+    <w:basedOn w:val="DefaultParagraphFont"/>
+    <w:link w:val="Title"/>
     <w:uiPriority w:val="10"/>
     <w:rsid w:val="00C3069D"/>
     <w:rPr>
@@ -2239,11 +2962,11 @@
       <w:szCs w:val="56"/>
     </w:rPr>
   </w:style>
-  <w:style w:type="paragraph" w:styleId="Alcm">
+  <w:style w:type="paragraph" w:styleId="Subtitle">
     <w:name w:val="Subtitle"/>
-    <w:basedOn w:val="Norml"/>
-    <w:next w:val="Norml"/>
-    <w:link w:val="AlcmChar"/>
+    <w:basedOn w:val="Normal"/>
+    <w:next w:val="Normal"/>
+    <w:link w:val="SubtitleChar"/>
     <w:uiPriority w:val="11"/>
     <w:qFormat/>
     <w:rsid w:val="00C3069D"/>
@@ -2260,10 +2983,10 @@
       <w:szCs w:val="28"/>
     </w:rPr>
   </w:style>
-  <w:style w:type="character" w:customStyle="1" w:styleId="AlcmChar">
-    <w:name w:val="Alcím Char"/>
-    <w:basedOn w:val="Bekezdsalapbettpusa"/>
-    <w:link w:val="Alcm"/>
+  <w:style w:type="character" w:customStyle="1" w:styleId="SubtitleChar">
+    <w:name w:val="Subtitle Char"/>
+    <w:basedOn w:val="DefaultParagraphFont"/>
+    <w:link w:val="Subtitle"/>
     <w:uiPriority w:val="11"/>
     <w:rsid w:val="00C3069D"/>
     <w:rPr>
@@ -2274,11 +2997,11 @@
       <w:szCs w:val="28"/>
     </w:rPr>
   </w:style>
-  <w:style w:type="paragraph" w:styleId="Idzet">
+  <w:style w:type="paragraph" w:styleId="Quote">
     <w:name w:val="Quote"/>
-    <w:basedOn w:val="Norml"/>
-    <w:next w:val="Norml"/>
-    <w:link w:val="IdzetChar"/>
+    <w:basedOn w:val="Normal"/>
+    <w:next w:val="Normal"/>
+    <w:link w:val="QuoteChar"/>
     <w:uiPriority w:val="29"/>
     <w:qFormat/>
     <w:rsid w:val="00C3069D"/>
@@ -2292,10 +3015,10 @@
       <w:color w:val="404040" w:themeColor="text1" w:themeTint="BF"/>
     </w:rPr>
   </w:style>
-  <w:style w:type="character" w:customStyle="1" w:styleId="IdzetChar">
-    <w:name w:val="Idézet Char"/>
-    <w:basedOn w:val="Bekezdsalapbettpusa"/>
-    <w:link w:val="Idzet"/>
+  <w:style w:type="character" w:customStyle="1" w:styleId="QuoteChar">
+    <w:name w:val="Quote Char"/>
+    <w:basedOn w:val="DefaultParagraphFont"/>
+    <w:link w:val="Quote"/>
     <w:uiPriority w:val="29"/>
     <w:rsid w:val="00C3069D"/>
     <w:rPr>
@@ -2304,9 +3027,9 @@
       <w:color w:val="404040" w:themeColor="text1" w:themeTint="BF"/>
     </w:rPr>
   </w:style>
-  <w:style w:type="paragraph" w:styleId="Listaszerbekezds">
+  <w:style w:type="paragraph" w:styleId="ListParagraph">
     <w:name w:val="List Paragraph"/>
-    <w:basedOn w:val="Norml"/>
+    <w:basedOn w:val="Normal"/>
     <w:uiPriority w:val="34"/>
     <w:qFormat/>
     <w:rsid w:val="00C3069D"/>
@@ -2315,9 +3038,9 @@
       <w:contextualSpacing/>
     </w:pPr>
   </w:style>
-  <w:style w:type="character" w:styleId="Erskiemels">
+  <w:style w:type="character" w:styleId="IntenseEmphasis">
     <w:name w:val="Intense Emphasis"/>
-    <w:basedOn w:val="Bekezdsalapbettpusa"/>
+    <w:basedOn w:val="DefaultParagraphFont"/>
     <w:uiPriority w:val="21"/>
     <w:qFormat/>
     <w:rsid w:val="00C3069D"/>
@@ -2327,11 +3050,11 @@
       <w:color w:val="0F4761" w:themeColor="accent1" w:themeShade="BF"/>
     </w:rPr>
   </w:style>
-  <w:style w:type="paragraph" w:styleId="Kiemeltidzet">
+  <w:style w:type="paragraph" w:styleId="IntenseQuote">
     <w:name w:val="Intense Quote"/>
-    <w:basedOn w:val="Norml"/>
-    <w:next w:val="Norml"/>
-    <w:link w:val="KiemeltidzetChar"/>
+    <w:basedOn w:val="Normal"/>
+    <w:next w:val="Normal"/>
+    <w:link w:val="IntenseQuoteChar"/>
     <w:uiPriority w:val="30"/>
     <w:qFormat/>
     <w:rsid w:val="00C3069D"/>
@@ -2350,10 +3073,10 @@
       <w:color w:val="0F4761" w:themeColor="accent1" w:themeShade="BF"/>
     </w:rPr>
   </w:style>
-  <w:style w:type="character" w:customStyle="1" w:styleId="KiemeltidzetChar">
-    <w:name w:val="Kiemelt idézet Char"/>
-    <w:basedOn w:val="Bekezdsalapbettpusa"/>
-    <w:link w:val="Kiemeltidzet"/>
+  <w:style w:type="character" w:customStyle="1" w:styleId="IntenseQuoteChar">
+    <w:name w:val="Intense Quote Char"/>
+    <w:basedOn w:val="DefaultParagraphFont"/>
+    <w:link w:val="IntenseQuote"/>
     <w:uiPriority w:val="30"/>
     <w:rsid w:val="00C3069D"/>
     <w:rPr>
@@ -2362,9 +3085,9 @@
       <w:color w:val="0F4761" w:themeColor="accent1" w:themeShade="BF"/>
     </w:rPr>
   </w:style>
-  <w:style w:type="character" w:styleId="Ershivatkozs">
+  <w:style w:type="character" w:styleId="IntenseReference">
     <w:name w:val="Intense Reference"/>
-    <w:basedOn w:val="Bekezdsalapbettpusa"/>
+    <w:basedOn w:val="DefaultParagraphFont"/>
     <w:uiPriority w:val="32"/>
     <w:qFormat/>
     <w:rsid w:val="00C3069D"/>
@@ -2376,9 +3099,9 @@
       <w:spacing w:val="5"/>
     </w:rPr>
   </w:style>
-  <w:style w:type="paragraph" w:styleId="Nincstrkz">
+  <w:style w:type="paragraph" w:styleId="NoSpacing">
     <w:name w:val="No Spacing"/>
-    <w:link w:val="NincstrkzChar"/>
+    <w:link w:val="NoSpacingChar"/>
     <w:uiPriority w:val="1"/>
     <w:qFormat/>
     <w:rsid w:val="00C84106"/>
@@ -2394,10 +3117,10 @@
       <w14:ligatures w14:val="none"/>
     </w:rPr>
   </w:style>
-  <w:style w:type="character" w:customStyle="1" w:styleId="NincstrkzChar">
-    <w:name w:val="Nincs térköz Char"/>
-    <w:basedOn w:val="Bekezdsalapbettpusa"/>
-    <w:link w:val="Nincstrkz"/>
+  <w:style w:type="character" w:customStyle="1" w:styleId="NoSpacingChar">
+    <w:name w:val="No Spacing Char"/>
+    <w:basedOn w:val="DefaultParagraphFont"/>
+    <w:link w:val="NoSpacing"/>
     <w:uiPriority w:val="1"/>
     <w:rsid w:val="00C84106"/>
     <w:rPr>
@@ -2407,6 +3130,75 @@
       <w:szCs w:val="22"/>
       <w:lang w:eastAsia="hu-HU"/>
       <w14:ligatures w14:val="none"/>
+    </w:rPr>
+  </w:style>
+  <w:style w:type="paragraph" w:styleId="TOCHeading">
+    <w:name w:val="TOC Heading"/>
+    <w:basedOn w:val="Heading1"/>
+    <w:next w:val="Normal"/>
+    <w:uiPriority w:val="39"/>
+    <w:unhideWhenUsed/>
+    <w:qFormat/>
+    <w:rsid w:val="0065753C"/>
+    <w:pPr>
+      <w:spacing w:before="240" w:after="0" w:line="259" w:lineRule="auto"/>
+      <w:outlineLvl w:val="9"/>
+    </w:pPr>
+    <w:rPr>
+      <w:kern w:val="0"/>
+      <w:sz w:val="32"/>
+      <w:szCs w:val="32"/>
+      <w:lang w:val="en-US"/>
+      <w14:ligatures w14:val="none"/>
+    </w:rPr>
+  </w:style>
+  <w:style w:type="paragraph" w:styleId="TOC1">
+    <w:name w:val="toc 1"/>
+    <w:basedOn w:val="Normal"/>
+    <w:next w:val="Normal"/>
+    <w:autoRedefine/>
+    <w:uiPriority w:val="39"/>
+    <w:unhideWhenUsed/>
+    <w:rsid w:val="0065753C"/>
+    <w:pPr>
+      <w:spacing w:after="100"/>
+    </w:pPr>
+  </w:style>
+  <w:style w:type="paragraph" w:styleId="TOC2">
+    <w:name w:val="toc 2"/>
+    <w:basedOn w:val="Normal"/>
+    <w:next w:val="Normal"/>
+    <w:autoRedefine/>
+    <w:uiPriority w:val="39"/>
+    <w:unhideWhenUsed/>
+    <w:rsid w:val="0065753C"/>
+    <w:pPr>
+      <w:spacing w:after="100"/>
+      <w:ind w:left="240"/>
+    </w:pPr>
+  </w:style>
+  <w:style w:type="paragraph" w:styleId="TOC3">
+    <w:name w:val="toc 3"/>
+    <w:basedOn w:val="Normal"/>
+    <w:next w:val="Normal"/>
+    <w:autoRedefine/>
+    <w:uiPriority w:val="39"/>
+    <w:unhideWhenUsed/>
+    <w:rsid w:val="0065753C"/>
+    <w:pPr>
+      <w:spacing w:after="100"/>
+      <w:ind w:left="480"/>
+    </w:pPr>
+  </w:style>
+  <w:style w:type="character" w:styleId="Hyperlink">
+    <w:name w:val="Hyperlink"/>
+    <w:basedOn w:val="DefaultParagraphFont"/>
+    <w:uiPriority w:val="99"/>
+    <w:unhideWhenUsed/>
+    <w:rsid w:val="0065753C"/>
+    <w:rPr>
+      <w:color w:val="467886" w:themeColor="hyperlink"/>
+      <w:u w:val="single"/>
     </w:rPr>
   </w:style>
 </w:styles>
@@ -2725,4 +3517,16 @@
     </a:ext>
   </a:extLst>
 </a:theme>
+</file>
+
+<file path=customXml/item1.xml><?xml version="1.0" encoding="utf-8"?>
+<b:Sources xmlns:b="http://schemas.openxmlformats.org/officeDocument/2006/bibliography" xmlns="http://schemas.openxmlformats.org/officeDocument/2006/bibliography" SelectedStyle="\APASixthEditionOfficeOnline.xsl" StyleName="APA" Version="6"/>
+</file>
+
+<file path=customXml/itemProps1.xml><?xml version="1.0" encoding="utf-8"?>
+<ds:datastoreItem xmlns:ds="http://schemas.openxmlformats.org/officeDocument/2006/customXml" ds:itemID="{FD505627-8A47-44F1-9002-5169A048A2AC}">
+  <ds:schemaRefs>
+    <ds:schemaRef ds:uri="http://schemas.openxmlformats.org/officeDocument/2006/bibliography"/>
+  </ds:schemaRefs>
+</ds:datastoreItem>
 </file>
</xml_diff>